<commit_message>
Update Software Engineer resume with 79 Nails & Hair project
Leads with the production booking platform (DB-enforced correctness,
RLS, CI, Zod validation, rate limiting, Sentry) ahead of the
e-commerce project — it's the strongest, most production-realistic
piece now. Updated the summary line and Technical Skills to match
(Next.js, Supabase/PostgreSQL, GitHub Actions, Vitest, Sentry, Zod).

Demoted Music Mixer Platform and AI Spam Detection System to one-line
entries in Additional Technical Projects to keep it to one page.
</commit_message>
<xml_diff>
--- a/public/resumes/Finn-Nguyen-Resume-Software-Engineer.docx
+++ b/public/resumes/Finn-Nguyen-Resume-Software-Engineer.docx
@@ -69,7 +69,7 @@
           <w:sz w:val="20"/>
           <w:szCs w:val="20"/>
         </w:rPr>
-        <w:t xml:space="preserve">Full-stack-focused Computer Science graduate with experience building and shipping multi-service applications using React, FastAPI/Flask, and SQL-backed systems, including a team-built e-commerce platform.</w:t>
+        <w:t>Full-stack-focused Computer Science graduate who ships production-grade systems — database-enforced correctness, Row Level Security, CI, automated testing, and error tracking — not just working demos. Experience with Next.js, React, Supabase/PostgreSQL, and FastAPI/Flask.</w:t>
       </w:r>
     </w:p>
     <w:p>
@@ -113,7 +113,7 @@
           <w:sz w:val="19"/>
           <w:szCs w:val="19"/>
         </w:rPr>
-        <w:t xml:space="preserve">Python, JavaScript, SQL, C++, C#</w:t>
+        <w:t>Python, JavaScript/TypeScript, SQL, C++, C#</w:t>
       </w:r>
     </w:p>
     <w:p>
@@ -138,7 +138,7 @@
           <w:sz w:val="19"/>
           <w:szCs w:val="19"/>
         </w:rPr>
-        <w:t xml:space="preserve">React, FastAPI, Flask, Strapi</w:t>
+        <w:t>Next.js, React, FastAPI, Flask, Strapi</w:t>
       </w:r>
     </w:p>
     <w:p>
@@ -163,7 +163,7 @@
           <w:sz w:val="19"/>
           <w:szCs w:val="19"/>
         </w:rPr>
-        <w:t xml:space="preserve">SQL Server</w:t>
+        <w:t>PostgreSQL (Supabase, Row Level Security), SQL Server</w:t>
       </w:r>
     </w:p>
     <w:p>
@@ -188,7 +188,7 @@
           <w:sz w:val="19"/>
           <w:szCs w:val="19"/>
         </w:rPr>
-        <w:t xml:space="preserve">Git, GitHub, VS Code</w:t>
+        <w:t>Git, GitHub Actions (CI/CD), Vitest, Sentry, Zod, Vercel, VS Code</w:t>
       </w:r>
     </w:p>
     <w:p>
@@ -223,7 +223,7 @@
           <w:sz w:val="20"/>
           <w:szCs w:val="20"/>
         </w:rPr>
-        <w:t xml:space="preserve">E-Commerce Platform (Zara-style) — Team Project</w:t>
+        <w:t>79 Nails &amp; Hair — Production Booking Platform — Personal Project</w:t>
       </w:r>
       <w:r>
         <w:rPr>
@@ -234,64 +234,64 @@
           <w:sz w:val="19"/>
           <w:szCs w:val="19"/>
         </w:rPr>
-        <w:t xml:space="preserve">  |  React, Strapi, SQL Server | 2025</w:t>
-      </w:r>
-    </w:p>
-    <w:p>
-      <w:pPr>
-        <w:pStyle w:val="ListParagraph"/>
-        <w:numPr>
-          <w:ilvl w:val="0"/>
-          <w:numId w:val="2"/>
-        </w:numPr>
-        <w:spacing w:after="40"/>
-      </w:pPr>
-      <w:r>
-        <w:rPr>
-          <w:rFonts w:ascii="Calibri" w:cs="Calibri" w:eastAsia="Calibri" w:hAnsi="Calibri"/>
-          <w:color w:val="222222"/>
-          <w:sz w:val="19"/>
-          <w:szCs w:val="19"/>
-        </w:rPr>
-        <w:t xml:space="preserve">Built a full-stack e-commerce platform with a React frontend, Strapi CMS backend, and SQL Server database as part of a small team.</w:t>
-      </w:r>
-    </w:p>
-    <w:p>
-      <w:pPr>
-        <w:pStyle w:val="ListParagraph"/>
-        <w:numPr>
-          <w:ilvl w:val="0"/>
-          <w:numId w:val="2"/>
-        </w:numPr>
-        <w:spacing w:after="40"/>
-      </w:pPr>
-      <w:r>
-        <w:rPr>
-          <w:rFonts w:ascii="Calibri" w:cs="Calibri" w:eastAsia="Calibri" w:hAnsi="Calibri"/>
-          <w:color w:val="222222"/>
-          <w:sz w:val="19"/>
-          <w:szCs w:val="19"/>
-        </w:rPr>
-        <w:t xml:space="preserve">Implemented secure authentication, payment gateway integration, and inventory/order management functionality.</w:t>
-      </w:r>
-    </w:p>
-    <w:p>
-      <w:pPr>
-        <w:pStyle w:val="ListParagraph"/>
-        <w:numPr>
-          <w:ilvl w:val="0"/>
-          <w:numId w:val="2"/>
-        </w:numPr>
-        <w:spacing w:after="40"/>
-      </w:pPr>
-      <w:r>
-        <w:rPr>
-          <w:rFonts w:ascii="Calibri" w:cs="Calibri" w:eastAsia="Calibri" w:hAnsi="Calibri"/>
-          <w:color w:val="222222"/>
-          <w:sz w:val="19"/>
-          <w:szCs w:val="19"/>
-        </w:rPr>
-        <w:t xml:space="preserve">Deployed the application to production (Vercel) and conducted performance optimization to improve scalability and user experience.</w:t>
+        <w:t xml:space="preserve">  |  Next.js, Supabase (PostgreSQL, RLS), Zod, Vitest, Sentry | 2026</w:t>
+      </w:r>
+    </w:p>
+    <w:p>
+      <w:pPr>
+        <w:pStyle w:val="ListParagraph"/>
+        <w:numPr>
+          <w:ilvl w:val="0"/>
+          <w:numId w:val="2"/>
+        </w:numPr>
+        <w:spacing w:after="40"/>
+      </w:pPr>
+      <w:r>
+        <w:rPr>
+          <w:rFonts w:ascii="Calibri" w:cs="Calibri" w:eastAsia="Calibri" w:hAnsi="Calibri"/>
+          <w:color w:val="222222"/>
+          <w:sz w:val="19"/>
+          <w:szCs w:val="19"/>
+        </w:rPr>
+        <w:t>Built and shipped a live booking platform for a real business, enforcing no-double-booking correctness at the database level via a Postgres exclusion constraint rather than an application-level check.</w:t>
+      </w:r>
+    </w:p>
+    <w:p>
+      <w:pPr>
+        <w:pStyle w:val="ListParagraph"/>
+        <w:numPr>
+          <w:ilvl w:val="0"/>
+          <w:numId w:val="2"/>
+        </w:numPr>
+        <w:spacing w:after="40"/>
+      </w:pPr>
+      <w:r>
+        <w:rPr>
+          <w:rFonts w:ascii="Calibri" w:cs="Calibri" w:eastAsia="Calibri" w:hAnsi="Calibri"/>
+          <w:color w:val="222222"/>
+          <w:sz w:val="19"/>
+          <w:szCs w:val="19"/>
+        </w:rPr>
+        <w:t>Implemented Row Level Security across every table as the authorization model, Zod-validated Server Actions at the trust boundary, and rate limiting via a SECURITY DEFINER Postgres function.</w:t>
+      </w:r>
+    </w:p>
+    <w:p>
+      <w:pPr>
+        <w:pStyle w:val="ListParagraph"/>
+        <w:numPr>
+          <w:ilvl w:val="0"/>
+          <w:numId w:val="2"/>
+        </w:numPr>
+        <w:spacing w:after="40"/>
+      </w:pPr>
+      <w:r>
+        <w:rPr>
+          <w:rFonts w:ascii="Calibri" w:cs="Calibri" w:eastAsia="Calibri" w:hAnsi="Calibri"/>
+          <w:color w:val="222222"/>
+          <w:sz w:val="19"/>
+          <w:szCs w:val="19"/>
+        </w:rPr>
+        <w:t>Set up CI (lint, typecheck, test, build) gating every deploy and verified Sentry error tracking end-to-end against a live deployment; found and fixed a stored-HTML-injection vulnerability in outbound emails along the way.</w:t>
       </w:r>
     </w:p>
     <w:p>
@@ -307,7 +307,7 @@
           <w:sz w:val="20"/>
           <w:szCs w:val="20"/>
         </w:rPr>
-        <w:t xml:space="preserve">Music Mixer Platform — Team Project</w:t>
+        <w:t xml:space="preserve">E-Commerce Platform (Zara-style) — Team Project</w:t>
       </w:r>
       <w:r>
         <w:rPr>
@@ -318,91 +318,64 @@
           <w:sz w:val="19"/>
           <w:szCs w:val="19"/>
         </w:rPr>
-        <w:t xml:space="preserve">  |  React, FastAPI, Firebase, Demucs, Python | 2025</w:t>
-      </w:r>
-    </w:p>
-    <w:p>
-      <w:pPr>
-        <w:pStyle w:val="ListParagraph"/>
-        <w:numPr>
-          <w:ilvl w:val="0"/>
-          <w:numId w:val="2"/>
-        </w:numPr>
-        <w:spacing w:after="40"/>
-      </w:pPr>
-      <w:r>
-        <w:rPr>
-          <w:rFonts w:ascii="Calibri" w:cs="Calibri" w:eastAsia="Calibri" w:hAnsi="Calibri"/>
-          <w:color w:val="222222"/>
-          <w:sz w:val="19"/>
-          <w:szCs w:val="19"/>
-        </w:rPr>
-        <w:t xml:space="preserve">Built a full-stack music-remixing application with AI-powered vocal/instrument separation using the Demucs deep learning model.</w:t>
-      </w:r>
-    </w:p>
-    <w:p>
-      <w:pPr>
-        <w:pStyle w:val="ListParagraph"/>
-        <w:numPr>
-          <w:ilvl w:val="0"/>
-          <w:numId w:val="2"/>
-        </w:numPr>
-        <w:spacing w:after="40"/>
-      </w:pPr>
-      <w:r>
-        <w:rPr>
-          <w:rFonts w:ascii="Calibri" w:cs="Calibri" w:eastAsia="Calibri" w:hAnsi="Calibri"/>
-          <w:color w:val="222222"/>
-          <w:sz w:val="19"/>
-          <w:szCs w:val="19"/>
-        </w:rPr>
-        <w:t xml:space="preserve">Integrated the Deezer API for real-time catalog search and implemented Firebase authentication and playlist management.</w:t>
-      </w:r>
-    </w:p>
-    <w:p>
-      <w:pPr>
-        <w:spacing w:after="20" w:before="100"/>
-      </w:pPr>
-      <w:r>
-        <w:rPr>
-          <w:rFonts w:ascii="Calibri" w:cs="Calibri" w:eastAsia="Calibri" w:hAnsi="Calibri"/>
-          <w:b/>
-          <w:bCs/>
-          <w:color w:val="222222"/>
-          <w:sz w:val="20"/>
-          <w:szCs w:val="20"/>
-        </w:rPr>
-        <w:t xml:space="preserve">AI Spam Detection System — Personal Project</w:t>
-      </w:r>
-      <w:r>
-        <w:rPr>
-          <w:rFonts w:ascii="Calibri" w:cs="Calibri" w:eastAsia="Calibri" w:hAnsi="Calibri"/>
-          <w:i/>
-          <w:iCs/>
-          <w:color w:val="555555"/>
-          <w:sz w:val="19"/>
-          <w:szCs w:val="19"/>
-        </w:rPr>
-        <w:t xml:space="preserve">  |  scikit-learn, Flask, Python | 2025</w:t>
-      </w:r>
-    </w:p>
-    <w:p>
-      <w:pPr>
-        <w:pStyle w:val="ListParagraph"/>
-        <w:numPr>
-          <w:ilvl w:val="0"/>
-          <w:numId w:val="2"/>
-        </w:numPr>
-        <w:spacing w:after="40"/>
-      </w:pPr>
-      <w:r>
-        <w:rPr>
-          <w:rFonts w:ascii="Calibri" w:cs="Calibri" w:eastAsia="Calibri" w:hAnsi="Calibri"/>
-          <w:color w:val="222222"/>
-          <w:sz w:val="19"/>
-          <w:szCs w:val="19"/>
-        </w:rPr>
-        <w:t xml:space="preserve">Built a Flask-based backend service to serve a trained classification model for real-time inference.</w:t>
+        <w:t xml:space="preserve">  |  React, Strapi, SQL Server | 2025</w:t>
+      </w:r>
+    </w:p>
+    <w:p>
+      <w:pPr>
+        <w:pStyle w:val="ListParagraph"/>
+        <w:numPr>
+          <w:ilvl w:val="0"/>
+          <w:numId w:val="2"/>
+        </w:numPr>
+        <w:spacing w:after="40"/>
+      </w:pPr>
+      <w:r>
+        <w:rPr>
+          <w:rFonts w:ascii="Calibri" w:cs="Calibri" w:eastAsia="Calibri" w:hAnsi="Calibri"/>
+          <w:color w:val="222222"/>
+          <w:sz w:val="19"/>
+          <w:szCs w:val="19"/>
+        </w:rPr>
+        <w:t xml:space="preserve">Built a full-stack e-commerce platform with a React frontend, Strapi CMS backend, and SQL Server database as part of a small team.</w:t>
+      </w:r>
+    </w:p>
+    <w:p>
+      <w:pPr>
+        <w:pStyle w:val="ListParagraph"/>
+        <w:numPr>
+          <w:ilvl w:val="0"/>
+          <w:numId w:val="2"/>
+        </w:numPr>
+        <w:spacing w:after="40"/>
+      </w:pPr>
+      <w:r>
+        <w:rPr>
+          <w:rFonts w:ascii="Calibri" w:cs="Calibri" w:eastAsia="Calibri" w:hAnsi="Calibri"/>
+          <w:color w:val="222222"/>
+          <w:sz w:val="19"/>
+          <w:szCs w:val="19"/>
+        </w:rPr>
+        <w:t xml:space="preserve">Implemented secure authentication, payment gateway integration, and inventory/order management functionality.</w:t>
+      </w:r>
+    </w:p>
+    <w:p>
+      <w:pPr>
+        <w:pStyle w:val="ListParagraph"/>
+        <w:numPr>
+          <w:ilvl w:val="0"/>
+          <w:numId w:val="2"/>
+        </w:numPr>
+        <w:spacing w:after="40"/>
+      </w:pPr>
+      <w:r>
+        <w:rPr>
+          <w:rFonts w:ascii="Calibri" w:cs="Calibri" w:eastAsia="Calibri" w:hAnsi="Calibri"/>
+          <w:color w:val="222222"/>
+          <w:sz w:val="19"/>
+          <w:szCs w:val="19"/>
+        </w:rPr>
+        <w:t xml:space="preserve">Deployed the application to production (Vercel) and conducted performance optimization to improve scalability and user experience.</w:t>
       </w:r>
     </w:p>
     <w:p>
@@ -460,6 +433,44 @@
           <w:szCs w:val="19"/>
         </w:rPr>
         <w:t xml:space="preserve">Supervised Learning — House Price &amp; Disease Prediction (scikit-learn) — regression/classification models, improved accuracy 78% → 85%.</w:t>
+      </w:r>
+    </w:p>
+    <w:p>
+      <w:pPr>
+        <w:pStyle w:val="ListParagraph"/>
+        <w:numPr>
+          <w:ilvl w:val="0"/>
+          <w:numId w:val="2"/>
+        </w:numPr>
+        <w:spacing w:after="40"/>
+      </w:pPr>
+      <w:r>
+        <w:rPr>
+          <w:rFonts w:ascii="Calibri" w:cs="Calibri" w:eastAsia="Calibri" w:hAnsi="Calibri"/>
+          <w:color w:val="222222"/>
+          <w:sz w:val="19"/>
+          <w:szCs w:val="19"/>
+        </w:rPr>
+        <w:t>Music Mixer Platform (React, FastAPI, Firebase, Demucs) — AI-powered vocal/instrument separation, Deezer API catalog search, Firebase authentication.</w:t>
+      </w:r>
+    </w:p>
+    <w:p>
+      <w:pPr>
+        <w:pStyle w:val="ListParagraph"/>
+        <w:numPr>
+          <w:ilvl w:val="0"/>
+          <w:numId w:val="2"/>
+        </w:numPr>
+        <w:spacing w:after="40"/>
+      </w:pPr>
+      <w:r>
+        <w:rPr>
+          <w:rFonts w:ascii="Calibri" w:cs="Calibri" w:eastAsia="Calibri" w:hAnsi="Calibri"/>
+          <w:color w:val="222222"/>
+          <w:sz w:val="19"/>
+          <w:szCs w:val="19"/>
+        </w:rPr>
+        <w:t>AI Spam Detection System (scikit-learn, Flask) — Flask backend serving a trained classifier for real-time inference.</w:t>
       </w:r>
     </w:p>
     <w:p>

</xml_diff>

<commit_message>
Add Claude-powered service search to 79 Nails & Hair project entry
Reflects the natural-language search feature just shipped: updated the
portfolio's project card (bullets, tech tags, expandable detail sections,
skills) and the Software Engineer resume (tech line, a new bullet, and
AI skills) to cover it.
</commit_message>
<xml_diff>
--- a/public/resumes/Finn-Nguyen-Resume-Software-Engineer.docx
+++ b/public/resumes/Finn-Nguyen-Resume-Software-Engineer.docx
@@ -138,7 +138,7 @@
           <w:sz w:val="19"/>
           <w:szCs w:val="19"/>
         </w:rPr>
-        <w:t>Next.js, React, FastAPI, Flask, Strapi</w:t>
+        <w:t>Next.js, React, FastAPI, Flask, Strapi, Anthropic Claude API, OpenAI GPT-4o-mini</w:t>
       </w:r>
     </w:p>
     <w:p>
@@ -234,7 +234,7 @@
           <w:sz w:val="19"/>
           <w:szCs w:val="19"/>
         </w:rPr>
-        <w:t xml:space="preserve">  |  Next.js, Supabase (PostgreSQL, RLS), Zod, Vitest, Sentry | 2026</w:t>
+        <w:t xml:space="preserve">  |  Next.js, Supabase (PostgreSQL, RLS), Anthropic Claude API, Zod, Vitest, Sentry | 2026</w:t>
       </w:r>
     </w:p>
     <w:p>
@@ -292,6 +292,18 @@
           <w:szCs w:val="19"/>
         </w:rPr>
         <w:t>Set up CI (lint, typecheck, test, build) gating every deploy and verified Sentry error tracking end-to-end against a live deployment; found and fixed a stored-HTML-injection vulnerability in outbound emails along the way.</w:t>
+      </w:r>
+    </w:p>
+    <w:p>
+      <w:pPr>
+        <w:pStyle w:val="ListParagraph"/>
+        <w:numPr>
+          <w:ilvl w:val="0"/>
+          <w:numId w:val="2"/>
+        </w:numPr>
+      </w:pPr>
+      <w:r>
+        <w:t>Built a Claude-powered natural-language service search — every match the model returns is re-validated in code against the real service catalog before reaching a customer, so a hallucinated or malformed result can never be shown.</w:t>
       </w:r>
     </w:p>
     <w:p>

</xml_diff>

<commit_message>
Update Turn Rotation story to cover both bugs found in testing
The manual production validation (350 assignments, 98% correct)
surfaced two real bugs, not one: the mixed haircut+nail rotation
issue and a separate close_workday bug that left reservations and
visits dangling. Both are now fixed and shipped, so the portfolio
and resume reflect the full story.
</commit_message>
<xml_diff>
--- a/public/resumes/Finn-Nguyen-Resume-Software-Engineer.docx
+++ b/public/resumes/Finn-Nguyen-Resume-Software-Engineer.docx
@@ -291,7 +291,7 @@
           <w:sz w:val="19"/>
           <w:szCs w:val="19"/>
         </w:rPr>
-        <w:t>Set up CI (lint, typecheck, test, build) gating every deploy and verified Sentry error tracking end-to-end against a live deployment; found and fixed a stored-HTML-injection vulnerability in outbound emails along the way.</w:t>
+        <w:t>Set up CI (lint, typecheck, test, build) gating every deploy across 18+ production deployments; 26 automated tests and a 100/100 Lighthouse score for accessibility, best practices, and SEO on the live site; found and fixed a stored-HTML-injection vulnerability in outbound emails along the way.</w:t>
       </w:r>
     </w:p>
     <w:p>
@@ -353,7 +353,19 @@
         </w:numPr>
       </w:pPr>
       <w:r>
-        <w:t>Deployed via AWS Amplify with Amazon Textract-assisted menu import behind a mandatory manager-review gate; verified the integration test suite via mutation testing and confirmed Sentry error tracking end-to-end in production.</w:t>
+        <w:t>Deployed via AWS Amplify with Amazon Textract-assisted menu import behind a mandatory manager-review gate; 53 automated tests (unit, real-Postgres integration, Playwright/axe-core accessibility) and a 100/100 Lighthouse accessibility score on the live deployment.</w:t>
+      </w:r>
+    </w:p>
+    <w:p>
+      <w:pPr>
+        <w:pStyle w:val="ListParagraph"/>
+        <w:numPr>
+          <w:ilvl w:val="0"/>
+          <w:numId w:val="2"/>
+        </w:numPr>
+      </w:pPr>
+      <w:r>
+        <w:t>Manually validated ~350 real rotation assignments (~50/day over a week) against the fairness rules — 98% correct; root-caused the 2% gap to two real bugs (mixed haircut+nail visits bypassing the haircut queue, and closing a day never releasing an unresolved reservation), reproduced each with a failing test against real Postgres, fixed both, and shipped to production the same day.</w:t>
       </w:r>
     </w:p>
     <w:p>

</xml_diff>